<commit_message>
print: the locked garbhagriha family published
Dark letterhead (A4 + US Letter + single-ink + chandra day editions +
Word template), redesigned receipt leaf and full-dark cover, updated
bilingual print guide.

Co-Authored-By: Claude Fable 5 <noreply@anthropic.com>
</commit_message>
<xml_diff>
--- a/print/letterhead/letterhead.docx
+++ b/print/letterhead/letterhead.docx
@@ -7,7 +7,7 @@
       <w:headerReference w:type="default" r:id="rId9"/>
       <w:footerReference w:type="default" r:id="rId10"/>
       <w:pgSz w:w="11906" w:h="16838"/>
-      <w:pgMar w:top="3288" w:right="1134" w:bottom="1587" w:left="1417" w:header="1020" w:footer="397" w:gutter="0"/>
+      <w:pgMar w:top="4535" w:right="1134" w:bottom="2551" w:left="1417" w:header="1020" w:footer="397" w:gutter="0"/>
       <w:cols w:space="720"/>
       <w:docGrid w:linePitch="360"/>
     </w:sectPr>
@@ -21,12 +21,13 @@
     <w:pPr>
       <w:pStyle w:val="Footer"/>
       <w:spacing w:after="0"/>
-      <w:jc w:val="center"/>
+      <w:ind w:left="-850"/>
+      <w:jc w:val="left"/>
     </w:pPr>
     <w:r>
       <w:drawing>
         <wp:inline xmlns:a="http://schemas.openxmlformats.org/drawingml/2006/main" xmlns:pic="http://schemas.openxmlformats.org/drawingml/2006/picture">
-          <wp:extent cx="5940000" cy="935221"/>
+          <wp:extent cx="6840000" cy="1224150"/>
           <wp:docPr id="1" name="Picture 1"/>
           <wp:cNvGraphicFramePr>
             <a:graphicFrameLocks noChangeAspect="1"/>
@@ -47,7 +48,7 @@
                 <pic:spPr>
                   <a:xfrm>
                     <a:off x="0" y="0"/>
-                    <a:ext cx="5940000" cy="935221"/>
+                    <a:ext cx="6840000" cy="1224150"/>
                   </a:xfrm>
                   <a:prstGeom prst="rect"/>
                 </pic:spPr>
@@ -67,12 +68,13 @@
     <w:pPr>
       <w:pStyle w:val="Header"/>
       <w:spacing w:after="0"/>
+      <w:ind w:left="-850"/>
       <w:jc w:val="left"/>
     </w:pPr>
     <w:r>
       <w:drawing>
         <wp:inline xmlns:a="http://schemas.openxmlformats.org/drawingml/2006/main" xmlns:pic="http://schemas.openxmlformats.org/drawingml/2006/picture">
-          <wp:extent cx="5940000" cy="1332173"/>
+          <wp:extent cx="6840000" cy="2376852"/>
           <wp:docPr id="1" name="Picture 1"/>
           <wp:cNvGraphicFramePr>
             <a:graphicFrameLocks noChangeAspect="1"/>
@@ -93,7 +95,7 @@
                 <pic:spPr>
                   <a:xfrm>
                     <a:off x="0" y="0"/>
-                    <a:ext cx="5940000" cy="1332173"/>
+                    <a:ext cx="6840000" cy="2376852"/>
                   </a:xfrm>
                   <a:prstGeom prst="rect"/>
                 </pic:spPr>

</xml_diff>